<commit_message>
Changed word document lines
</commit_message>
<xml_diff>
--- a/New Microsoft Word Document.docx
+++ b/New Microsoft Word Document.docx
@@ -4,7 +4,15 @@
   <w:body>
     <w:p>
       <w:r>
-        <w:t>Line1</w:t>
+        <w:t>Line</w:t>
+      </w:r>
+      <w:r>
+        <w:t>3</w:t>
+      </w:r>
+    </w:p>
+    <w:p>
+      <w:r>
+        <w:t>Line 2</w:t>
       </w:r>
     </w:p>
     <w:sectPr>

</xml_diff>

<commit_message>
Made line4 line 5 change
</commit_message>
<xml_diff>
--- a/New Microsoft Word Document.docx
+++ b/New Microsoft Word Document.docx
@@ -4,7 +4,15 @@
   <w:body>
     <w:p>
       <w:r>
-        <w:t>Line1</w:t>
+        <w:t>Line</w:t>
+      </w:r>
+      <w:r>
+        <w:t>4</w:t>
+      </w:r>
+    </w:p>
+    <w:p>
+      <w:r>
+        <w:t>Line 5</w:t>
       </w:r>
     </w:p>
     <w:sectPr>

</xml_diff>